<commit_message>
Update Payroll templates and release artifacts
</commit_message>
<xml_diff>
--- a/Template/Payroll/1. หนังสือส่งเบิกจ้างเหมา.docx
+++ b/Template/Payroll/1. หนังสือส่งเบิกจ้างเหมา.docx
@@ -37,7 +37,7 @@
           <v:shape id="_x0000_s2057" type="#_x0000_t75" style="position:absolute;margin-left:172.85pt;margin-top:-22.8pt;width:85.05pt;height:85.05pt;z-index:-251658240">
             <v:imagedata r:id="rId8" o:title=""/>
           </v:shape>
-          <o:OLEObject Type="Embed" ProgID="MSPhotoEd.3" ShapeID="_x0000_s2057" DrawAspect="Content" ObjectID="_1845115464" r:id="rId9"/>
+          <o:OLEObject Type="Embed" ProgID="MSPhotoEd.3" ShapeID="_x0000_s2057" DrawAspect="Content" ObjectID="_1850629255" r:id="rId9"/>
         </w:object>
       </w:r>
     </w:p>
@@ -130,7 +130,15 @@
           <w:rFonts w:ascii="TH SarabunIT๙" w:hAnsi="TH SarabunIT๙" w:cs="TH SarabunIT๙" w:hint="cs"/>
           <w:cs/>
         </w:rPr>
-        <w:t xml:space="preserve">     </w:t>
+        <w:t xml:space="preserve">  </w:t>
+      </w:r>
+      <w:proofErr w:type="gramStart"/>
+      <w:r>
+        <w:rPr>
+          <w:rFonts w:ascii="TH SarabunIT๙" w:hAnsi="TH SarabunIT๙" w:cs="TH SarabunIT๙" w:hint="cs"/>
+          <w:cs/>
+        </w:rPr>
+        <w:t xml:space="preserve">   </w:t>
       </w:r>
       <w:r>
         <w:rPr>
@@ -156,7 +164,15 @@
           <w:rFonts w:ascii="TH SarabunIT๙" w:hAnsi="TH SarabunIT๙" w:cs="TH SarabunIT๙" w:hint="cs"/>
           <w:cs/>
         </w:rPr>
-        <w:t xml:space="preserve">      </w:t>
+        <w:t xml:space="preserve">   </w:t>
+      </w:r>
+      <w:proofErr w:type="gramEnd"/>
+      <w:r>
+        <w:rPr>
+          <w:rFonts w:ascii="TH SarabunIT๙" w:hAnsi="TH SarabunIT๙" w:cs="TH SarabunIT๙" w:hint="cs"/>
+          <w:cs/>
+        </w:rPr>
+        <w:t xml:space="preserve">   </w:t>
       </w:r>
       <w:r>
         <w:rPr>
@@ -394,16 +410,22 @@
       </w:r>
       <w:r>
         <w:rPr>
-          <w:rFonts w:ascii="TH SarabunIT๙" w:hAnsi="TH SarabunIT๙" w:cs="TH SarabunIT๙" w:hint="cs"/>
-          <w:cs/>
-        </w:rPr>
-        <w:t>สำนักงานเขตพื้นที่การศึกษาประถมศึกษาแม่ฮ่องสอน เขต</w:t>
-      </w:r>
-      <w:r>
-        <w:rPr>
-          <w:rFonts w:ascii="TH SarabunIT๙" w:hAnsi="TH SarabunIT๙" w:cs="TH SarabunIT๙"/>
-        </w:rPr>
-        <w:t xml:space="preserve"> 2</w:t>
+          <w:rFonts w:ascii="TH SarabunIT๙" w:hAnsi="TH SarabunIT๙" w:cs="TH SarabunIT๙"/>
+        </w:rPr>
+        <w:t>{</w:t>
+      </w:r>
+      <w:r>
+        <w:rPr>
+          <w:rFonts w:ascii="TH SarabunIT๙" w:hAnsi="TH SarabunIT๙" w:cs="TH SarabunIT๙" w:hint="cs"/>
+          <w:cs/>
+        </w:rPr>
+        <w:t>ชื่อเขต</w:t>
+      </w:r>
+      <w:r>
+        <w:rPr>
+          <w:rFonts w:ascii="TH SarabunIT๙" w:hAnsi="TH SarabunIT๙" w:cs="TH SarabunIT๙"/>
+        </w:rPr>
+        <w:t>}</w:t>
       </w:r>
     </w:p>
     <w:p>
@@ -596,13 +618,26 @@
           <w:rFonts w:ascii="TH SarabunIT๙" w:hAnsi="TH SarabunIT๙" w:cs="TH SarabunIT๙" w:hint="cs"/>
           <w:cs/>
         </w:rPr>
-        <w:t>ตามที่สำนักงานเขตพื้นที่การศึกษาประถมศึกษาแม่ฮ่องสอน เขต</w:t>
-      </w:r>
-      <w:r>
-        <w:rPr>
-          <w:rFonts w:ascii="TH SarabunIT๙" w:hAnsi="TH SarabunIT๙" w:cs="TH SarabunIT๙"/>
-        </w:rPr>
-        <w:t xml:space="preserve"> 2</w:t>
+        <w:t>ตามที่</w:t>
+      </w:r>
+      <w:r>
+        <w:rPr>
+          <w:rFonts w:ascii="TH SarabunIT๙" w:hAnsi="TH SarabunIT๙" w:cs="TH SarabunIT๙"/>
+        </w:rPr>
+        <w:t>{</w:t>
+      </w:r>
+      <w:r>
+        <w:rPr>
+          <w:rFonts w:ascii="TH SarabunIT๙" w:hAnsi="TH SarabunIT๙" w:cs="TH SarabunIT๙" w:hint="cs"/>
+          <w:cs/>
+        </w:rPr>
+        <w:t>ชื่อเขต</w:t>
+      </w:r>
+      <w:r>
+        <w:rPr>
+          <w:rFonts w:ascii="TH SarabunIT๙" w:hAnsi="TH SarabunIT๙" w:cs="TH SarabunIT๙"/>
+        </w:rPr>
+        <w:t>}</w:t>
       </w:r>
       <w:r>
         <w:rPr>
@@ -979,16 +1014,16 @@
         <mc:AlternateContent>
           <mc:Choice Requires="wps">
             <w:drawing>
-              <wp:anchor distT="45720" distB="45720" distL="114300" distR="114300" simplePos="0" relativeHeight="251657216" behindDoc="0" locked="0" layoutInCell="1" allowOverlap="1" wp14:anchorId="7FE3499C" wp14:editId="5040C8F4">
+              <wp:anchor distT="45720" distB="45720" distL="114300" distR="114300" simplePos="0" relativeHeight="251657216" behindDoc="0" locked="0" layoutInCell="1" allowOverlap="1" wp14:anchorId="7FE3499C" wp14:editId="2271F95D">
                 <wp:simplePos x="0" y="0"/>
                 <wp:positionH relativeFrom="margin">
-                  <wp:posOffset>1571625</wp:posOffset>
+                  <wp:posOffset>1567815</wp:posOffset>
                 </wp:positionH>
                 <wp:positionV relativeFrom="paragraph">
-                  <wp:posOffset>15240</wp:posOffset>
+                  <wp:posOffset>10795</wp:posOffset>
                 </wp:positionV>
-                <wp:extent cx="3381375" cy="1404620"/>
-                <wp:effectExtent l="0" t="0" r="9525" b="7620"/>
+                <wp:extent cx="3381375" cy="847725"/>
+                <wp:effectExtent l="0" t="0" r="9525" b="9525"/>
                 <wp:wrapNone/>
                 <wp:docPr id="1390262210" name="Text Box 2"/>
                 <wp:cNvGraphicFramePr>
@@ -1003,7 +1038,7 @@
                       <wps:spPr bwMode="auto">
                         <a:xfrm>
                           <a:off x="0" y="0"/>
-                          <a:ext cx="3381375" cy="1404620"/>
+                          <a:ext cx="3381375" cy="847725"/>
                         </a:xfrm>
                         <a:prstGeom prst="rect">
                           <a:avLst/>
@@ -1172,7 +1207,7 @@
                         </w:txbxContent>
                       </wps:txbx>
                       <wps:bodyPr rot="0" vert="horz" wrap="square" lIns="91440" tIns="45720" rIns="91440" bIns="45720" anchor="t" anchorCtr="0">
-                        <a:spAutoFit/>
+                        <a:noAutofit/>
                       </wps:bodyPr>
                     </wps:wsp>
                   </a:graphicData>
@@ -1181,7 +1216,7 @@
                   <wp14:pctWidth>0</wp14:pctWidth>
                 </wp14:sizeRelH>
                 <wp14:sizeRelV relativeFrom="margin">
-                  <wp14:pctHeight>20000</wp14:pctHeight>
+                  <wp14:pctHeight>0</wp14:pctHeight>
                 </wp14:sizeRelV>
               </wp:anchor>
             </w:drawing>
@@ -1192,8 +1227,8 @@
                 <v:stroke joinstyle="miter"/>
                 <v:path gradientshapeok="t" o:connecttype="rect"/>
               </v:shapetype>
-              <v:shape id="Text Box 2" o:spid="_x0000_s1026" type="#_x0000_t202" style="position:absolute;margin-left:123.75pt;margin-top:1.2pt;width:266.25pt;height:110.6pt;z-index:251659776;visibility:visible;mso-wrap-style:square;mso-width-percent:0;mso-height-percent:200;mso-wrap-distance-left:9pt;mso-wrap-distance-top:3.6pt;mso-wrap-distance-right:9pt;mso-wrap-distance-bottom:3.6pt;mso-position-horizontal:absolute;mso-position-horizontal-relative:margin;mso-position-vertical:absolute;mso-position-vertical-relative:text;mso-width-percent:0;mso-height-percent:200;mso-width-relative:margin;mso-height-relative:margin;v-text-anchor:top" o:gfxdata="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" stroked="f">
-                <v:textbox style="mso-fit-shape-to-text:t">
+              <v:shape id="Text Box 2" o:spid="_x0000_s1026" type="#_x0000_t202" style="position:absolute;margin-left:123.45pt;margin-top:.85pt;width:266.25pt;height:66.75pt;z-index:251657216;visibility:visible;mso-wrap-style:square;mso-width-percent:0;mso-height-percent:0;mso-wrap-distance-left:9pt;mso-wrap-distance-top:3.6pt;mso-wrap-distance-right:9pt;mso-wrap-distance-bottom:3.6pt;mso-position-horizontal:absolute;mso-position-horizontal-relative:margin;mso-position-vertical:absolute;mso-position-vertical-relative:text;mso-width-percent:0;mso-height-percent:0;mso-width-relative:margin;mso-height-relative:margin;v-text-anchor:top" o:gfxdata="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" stroked="f">
+                <v:textbox>
                   <w:txbxContent>
                     <w:p>
                       <w:pPr>
@@ -1313,7 +1348,7 @@
                       <w:pPr>
                         <w:jc w:val="center"/>
                         <w:rPr>
-                          <w:rFonts w:ascii="TH SarabunIT๙" w:hAnsi="TH SarabunIT๙" w:cs="TH SarabunIT๙" w:hint="cs"/>
+                          <w:rFonts w:ascii="TH SarabunIT๙" w:hAnsi="TH SarabunIT๙" w:cs="TH SarabunIT๙"/>
                           <w:cs/>
                         </w:rPr>
                       </w:pPr>

</xml_diff>